<commit_message>
fix(outputs): apply clinical-safety and security review of the MDT record export (#73)
Notes, conflicts and missing items are printed under each section label; diagnosis, morphology and
comorbidities cite their source documents; partial confirmation and who/when are shown; the draft
banner repeats on every page and in the file name; epicrisis is listed per cited fact; internal
keys, ISO timestamps, "1" units and day-exact onset dates no longer leak into the text.
Security: values are sanitised (lone surrogates truncated the file, layout control characters,
birth numbers), Jinja is sandboxed, the rendered file is verified complete, the sample form's
author and tenant label metadata are removed, the role gate runs before the audited read and the
audit names patient and episode.

Co-Authored-By: Claude Sonnet 5.5 <noreply@anthropic.com>
Claude-Session: https://claude.ai/code/session_01KCgkv59B6ZUNYz8GBohyR7
</commit_message>
<xml_diff>
--- a/backend/app/outputs/templates/mdt_zapis.docx
+++ b/backend/app/outputs/templates/mdt_zapis.docx
@@ -1350,7 +1350,7 @@
           <w:b/>
           <w:sz w:val="26"/>
         </w:rPr>
-        <w:t>Příloha A – Nesrovnalosti a chybějící údaje (stav k MDT)</w:t>
+        <w:t>Příloha A – Nesrovnalosti v dokumentaci (stav k MDT)</w:t>
       </w:r>
     </w:p>
     <w:p>
@@ -1374,7 +1374,7 @@
           <w:b/>
           <w:sz w:val="26"/>
         </w:rPr>
-        <w:t>Příloha B – Dokumenty nezahrnuté do podkladu (po MDT)</w:t>
+        <w:t>Příloha B – Dokumenty nezahrnuté do podkladu</w:t>
       </w:r>
     </w:p>
     <w:p>
@@ -1441,6 +1441,7 @@
       </w:r>
     </w:p>
     <w:sectPr>
+      <w:headerReference w:type="default" r:id="rId7"/>
       <w:pgSz w:w="11906" w:h="16838"/>
       <w:pgMar w:top="1000" w:right="1440" w:bottom="900" w:left="1440" w:header="708" w:footer="708" w:gutter="0"/>
       <w:cols w:space="708"/>
@@ -1448,6 +1449,19 @@
     </w:sectPr>
   </w:body>
 </w:document>
+</file>
+
+<file path=word/header1.xml><?xml version="1.0" encoding="utf-8"?>
+<w:hdr xmlns:m="http://schemas.openxmlformats.org/officeDocument/2006/math" xmlns:mc="http://schemas.openxmlformats.org/markup-compatibility/2006" xmlns:mo="http://schemas.microsoft.com/office/mac/office/2008/main" xmlns:mv="urn:schemas-microsoft-com:mac:vml" xmlns:o="urn:schemas-microsoft-com:office:office" xmlns:r="http://schemas.openxmlformats.org/officeDocument/2006/relationships" xmlns:v="urn:schemas-microsoft-com:vml" xmlns:w10="urn:schemas-microsoft-com:office:word" xmlns:w14="http://schemas.microsoft.com/office/word/2010/wordml" xmlns:w="http://schemas.openxmlformats.org/wordprocessingml/2006/main" xmlns:wne="http://schemas.microsoft.com/office/word/2006/wordml" xmlns:wp14="http://schemas.microsoft.com/office/word/2010/wordprocessingDrawing" xmlns:wp="http://schemas.openxmlformats.org/drawingml/2006/wordprocessingDrawing" xmlns:wpc="http://schemas.microsoft.com/office/word/2010/wordprocessingCanvas" xmlns:wpg="http://schemas.microsoft.com/office/word/2010/wordprocessingGroup" xmlns:wpi="http://schemas.microsoft.com/office/word/2010/wordprocessingInk" xmlns:wps="http://schemas.microsoft.com/office/word/2010/wordprocessingShape" mc:Ignorable="w14 wp14">
+  <w:p>
+    <w:pPr>
+      <w:pStyle w:val="Header"/>
+    </w:pPr>
+    <w:r>
+      <w:t>{{r page_banner }}</w:t>
+    </w:r>
+  </w:p>
+</w:hdr>
 </file>
 
 <file path=word/numbering.xml><?xml version="1.0" encoding="utf-8"?>

</xml_diff>

<commit_message>
feat(outputs): MDT record as PDF and with the signed conclusion after the meeting (#89, #92)
- one renderer-neutral document model (build_context) for DOCX and PDF
- PDF via reportlab with bundled DejaVu Sans (Czech glyphs), draft marker on every page
- section 6 prints the signed MDT conclusion as signed (Potvrzeno lékařem, who, when);
  section 7 points to it, never split or generated
- GET /mdt-record?format=pdf; the conclusion's Composition is audited with the export

Co-Authored-By: Claude Opus 5.5 <noreply@anthropic.com>
Claude-Session: https://claude.ai/code/session_01RdeCUnsaEHu2XdDWoMFXcM
</commit_message>
<xml_diff>
--- a/backend/app/outputs/templates/mdt_zapis.docx
+++ b/backend/app/outputs/templates/mdt_zapis.docx
@@ -1238,7 +1238,11 @@
               <w:right w:w="140" w:type="dxa"/>
             </w:tcMar>
           </w:tcPr>
-          <w:p/>
+          <w:p>
+            <w:r>
+              <w:t>{{ conclusion_text }}</w:t>
+            </w:r>
+          </w:p>
         </w:tc>
       </w:tr>
     </w:tbl>

</xml_diff>